<commit_message>
docs: make first-run commands copyable
</commit_message>
<xml_diff>
--- a/UI-UX/docs/first-run-ui-v1.docx
+++ b/UI-UX/docs/first-run-ui-v1.docx
@@ -165,11 +165,9 @@
       </w:pPr>
       <w:r>
         <w:rPr>
-          <w:rFonts w:ascii="Calibri" w:hAnsi="Calibri" w:eastAsia="Calibri"/>
-          <w:b w:val="0"/>
-          <w:sz w:val="22"/>
+          <w:rFonts w:ascii="Calibri" w:hAnsi="Calibri"/>
         </w:rPr>
-        <w:t>Ниже команды приведены для Git Bash.</w:t>
+        <w:t>Ниже команды приведены для Git Bash. Их можно выделить, скопировать и вставить в терминал как обычный текст.</w:t>
       </w:r>
     </w:p>
     <w:p>
@@ -199,35 +197,21 @@
         <w:t>Пример:</w:t>
       </w:r>
     </w:p>
-    <w:tbl>
-      <w:tblPr>
-        <w:tblW w:type="auto" w:w="0"/>
-        <w:tblLayout w:type="autofit"/>
-        <w:tblLook w:firstColumn="1" w:firstRow="1" w:lastColumn="0" w:lastRow="0" w:noHBand="0" w:noVBand="1" w:val="04A0"/>
-      </w:tblPr>
-      <w:tblGrid>
-        <w:gridCol w:w="10080"/>
-      </w:tblGrid>
-      <w:tr>
-        <w:tc>
-          <w:tcPr>
-            <w:tcW w:type="dxa" w:w="10080"/>
-            <w:shd w:fill="EEF5FB"/>
-          </w:tcPr>
-          <w:p>
-            <w:r>
-              <w:rPr>
-                <w:rFonts w:ascii="Consolas" w:hAnsi="Consolas" w:eastAsia="Consolas"/>
-                <w:b w:val="0"/>
-                <w:color w:val="1F4E79"/>
-                <w:sz w:val="19"/>
-              </w:rPr>
-              <w:t>cd ~/Documents/GitHub</w:t>
-            </w:r>
-          </w:p>
-        </w:tc>
-      </w:tr>
-    </w:tbl>
+    <w:p>
+      <w:pPr>
+        <w:spacing w:before="60" w:after="120" w:line="260" w:lineRule="auto"/>
+        <w:ind w:left="360"/>
+        <w:shd w:val="clear" w:color="auto" w:fill="F3F5F6"/>
+      </w:pPr>
+      <w:r>
+        <w:rPr>
+          <w:rFonts w:ascii="Consolas" w:hAnsi="Consolas" w:cs="Consolas"/>
+          <w:color w:val="1F2933"/>
+          <w:sz w:val="21"/>
+        </w:rPr>
+        <w:t xml:space="preserve">cd ~/Documents/GitHub</w:t>
+      </w:r>
+    </w:p>
     <w:p/>
     <w:p>
       <w:pPr>
@@ -256,35 +240,21 @@
         <w:t>4. Клонировать репозиторий</w:t>
       </w:r>
     </w:p>
-    <w:tbl>
-      <w:tblPr>
-        <w:tblW w:type="auto" w:w="0"/>
-        <w:tblLayout w:type="autofit"/>
-        <w:tblLook w:firstColumn="1" w:firstRow="1" w:lastColumn="0" w:lastRow="0" w:noHBand="0" w:noVBand="1" w:val="04A0"/>
-      </w:tblPr>
-      <w:tblGrid>
-        <w:gridCol w:w="10080"/>
-      </w:tblGrid>
-      <w:tr>
-        <w:tc>
-          <w:tcPr>
-            <w:tcW w:type="dxa" w:w="10080"/>
-            <w:shd w:fill="EEF5FB"/>
-          </w:tcPr>
-          <w:p>
-            <w:r>
-              <w:rPr>
-                <w:rFonts w:ascii="Consolas" w:hAnsi="Consolas" w:eastAsia="Consolas"/>
-                <w:b w:val="0"/>
-                <w:color w:val="1F4E79"/>
-                <w:sz w:val="19"/>
-              </w:rPr>
-              <w:t>git clone https://github.com/NeuronsUII/PKB_neuroassistant.git</w:t>
-            </w:r>
-          </w:p>
-        </w:tc>
-      </w:tr>
-    </w:tbl>
+    <w:p>
+      <w:pPr>
+        <w:spacing w:before="60" w:after="120" w:line="260" w:lineRule="auto"/>
+        <w:ind w:left="360"/>
+        <w:shd w:val="clear" w:color="auto" w:fill="F3F5F6"/>
+      </w:pPr>
+      <w:r>
+        <w:rPr>
+          <w:rFonts w:ascii="Consolas" w:hAnsi="Consolas" w:cs="Consolas"/>
+          <w:color w:val="1F2933"/>
+          <w:sz w:val="21"/>
+        </w:rPr>
+        <w:t xml:space="preserve">git clone https://github.com/NeuronsUII/PKB_neuroassistant.git</w:t>
+      </w:r>
+    </w:p>
     <w:p/>
     <w:p>
       <w:pPr>
@@ -300,35 +270,21 @@
         <w:t>5. Перейти в папку проекта</w:t>
       </w:r>
     </w:p>
-    <w:tbl>
-      <w:tblPr>
-        <w:tblW w:type="auto" w:w="0"/>
-        <w:tblLayout w:type="autofit"/>
-        <w:tblLook w:firstColumn="1" w:firstRow="1" w:lastColumn="0" w:lastRow="0" w:noHBand="0" w:noVBand="1" w:val="04A0"/>
-      </w:tblPr>
-      <w:tblGrid>
-        <w:gridCol w:w="10080"/>
-      </w:tblGrid>
-      <w:tr>
-        <w:tc>
-          <w:tcPr>
-            <w:tcW w:type="dxa" w:w="10080"/>
-            <w:shd w:fill="EEF5FB"/>
-          </w:tcPr>
-          <w:p>
-            <w:r>
-              <w:rPr>
-                <w:rFonts w:ascii="Consolas" w:hAnsi="Consolas" w:eastAsia="Consolas"/>
-                <w:b w:val="0"/>
-                <w:color w:val="1F4E79"/>
-                <w:sz w:val="19"/>
-              </w:rPr>
-              <w:t>cd PKB_neuroassistant</w:t>
-            </w:r>
-          </w:p>
-        </w:tc>
-      </w:tr>
-    </w:tbl>
+    <w:p>
+      <w:pPr>
+        <w:spacing w:before="60" w:after="120" w:line="260" w:lineRule="auto"/>
+        <w:ind w:left="360"/>
+        <w:shd w:val="clear" w:color="auto" w:fill="F3F5F6"/>
+      </w:pPr>
+      <w:r>
+        <w:rPr>
+          <w:rFonts w:ascii="Consolas" w:hAnsi="Consolas" w:cs="Consolas"/>
+          <w:color w:val="1F2933"/>
+          <w:sz w:val="21"/>
+        </w:rPr>
+        <w:t xml:space="preserve">cd PKB_neuroassistant</w:t>
+      </w:r>
+    </w:p>
     <w:p/>
     <w:p>
       <w:pPr>
@@ -344,35 +300,21 @@
         <w:t>6. Переключиться на ветку с UI v1</w:t>
       </w:r>
     </w:p>
-    <w:tbl>
-      <w:tblPr>
-        <w:tblW w:type="auto" w:w="0"/>
-        <w:tblLayout w:type="autofit"/>
-        <w:tblLook w:firstColumn="1" w:firstRow="1" w:lastColumn="0" w:lastRow="0" w:noHBand="0" w:noVBand="1" w:val="04A0"/>
-      </w:tblPr>
-      <w:tblGrid>
-        <w:gridCol w:w="10080"/>
-      </w:tblGrid>
-      <w:tr>
-        <w:tc>
-          <w:tcPr>
-            <w:tcW w:type="dxa" w:w="10080"/>
-            <w:shd w:fill="EEF5FB"/>
-          </w:tcPr>
-          <w:p>
-            <w:r>
-              <w:rPr>
-                <w:rFonts w:ascii="Consolas" w:hAnsi="Consolas" w:eastAsia="Consolas"/>
-                <w:b w:val="0"/>
-                <w:color w:val="1F4E79"/>
-                <w:sz w:val="19"/>
-              </w:rPr>
-              <w:t>git checkout feature/ui-import-frontend-v1</w:t>
-            </w:r>
-          </w:p>
-        </w:tc>
-      </w:tr>
-    </w:tbl>
+    <w:p>
+      <w:pPr>
+        <w:spacing w:before="60" w:after="120" w:line="260" w:lineRule="auto"/>
+        <w:ind w:left="360"/>
+        <w:shd w:val="clear" w:color="auto" w:fill="F3F5F6"/>
+      </w:pPr>
+      <w:r>
+        <w:rPr>
+          <w:rFonts w:ascii="Consolas" w:hAnsi="Consolas" w:cs="Consolas"/>
+          <w:color w:val="1F2933"/>
+          <w:sz w:val="21"/>
+        </w:rPr>
+        <w:t xml:space="preserve">git checkout feature/ui-import-frontend-v1</w:t>
+      </w:r>
+    </w:p>
     <w:p/>
     <w:p>
       <w:pPr>
@@ -388,35 +330,21 @@
         <w:t>7. Перейти в папку первой версии интерфейса</w:t>
       </w:r>
     </w:p>
-    <w:tbl>
-      <w:tblPr>
-        <w:tblW w:type="auto" w:w="0"/>
-        <w:tblLayout w:type="autofit"/>
-        <w:tblLook w:firstColumn="1" w:firstRow="1" w:lastColumn="0" w:lastRow="0" w:noHBand="0" w:noVBand="1" w:val="04A0"/>
-      </w:tblPr>
-      <w:tblGrid>
-        <w:gridCol w:w="10080"/>
-      </w:tblGrid>
-      <w:tr>
-        <w:tc>
-          <w:tcPr>
-            <w:tcW w:type="dxa" w:w="10080"/>
-            <w:shd w:fill="EEF5FB"/>
-          </w:tcPr>
-          <w:p>
-            <w:r>
-              <w:rPr>
-                <w:rFonts w:ascii="Consolas" w:hAnsi="Consolas" w:eastAsia="Consolas"/>
-                <w:b w:val="0"/>
-                <w:color w:val="1F4E79"/>
-                <w:sz w:val="19"/>
-              </w:rPr>
-              <w:t>cd UI-UX/frontend-v1</w:t>
-            </w:r>
-          </w:p>
-        </w:tc>
-      </w:tr>
-    </w:tbl>
+    <w:p>
+      <w:pPr>
+        <w:spacing w:before="60" w:after="120" w:line="260" w:lineRule="auto"/>
+        <w:ind w:left="360"/>
+        <w:shd w:val="clear" w:color="auto" w:fill="F3F5F6"/>
+      </w:pPr>
+      <w:r>
+        <w:rPr>
+          <w:rFonts w:ascii="Consolas" w:hAnsi="Consolas" w:cs="Consolas"/>
+          <w:color w:val="1F2933"/>
+          <w:sz w:val="21"/>
+        </w:rPr>
+        <w:t xml:space="preserve">cd UI-UX/frontend-v1</w:t>
+      </w:r>
+    </w:p>
     <w:p/>
     <w:p>
       <w:pPr>
@@ -432,35 +360,21 @@
         <w:t>8. Запустить проект через Docker</w:t>
       </w:r>
     </w:p>
-    <w:tbl>
-      <w:tblPr>
-        <w:tblW w:type="auto" w:w="0"/>
-        <w:tblLayout w:type="autofit"/>
-        <w:tblLook w:firstColumn="1" w:firstRow="1" w:lastColumn="0" w:lastRow="0" w:noHBand="0" w:noVBand="1" w:val="04A0"/>
-      </w:tblPr>
-      <w:tblGrid>
-        <w:gridCol w:w="10080"/>
-      </w:tblGrid>
-      <w:tr>
-        <w:tc>
-          <w:tcPr>
-            <w:tcW w:type="dxa" w:w="10080"/>
-            <w:shd w:fill="EEF5FB"/>
-          </w:tcPr>
-          <w:p>
-            <w:r>
-              <w:rPr>
-                <w:rFonts w:ascii="Consolas" w:hAnsi="Consolas" w:eastAsia="Consolas"/>
-                <w:b w:val="0"/>
-                <w:color w:val="1F4E79"/>
-                <w:sz w:val="19"/>
-              </w:rPr>
-              <w:t>docker compose up --build</w:t>
-            </w:r>
-          </w:p>
-        </w:tc>
-      </w:tr>
-    </w:tbl>
+    <w:p>
+      <w:pPr>
+        <w:spacing w:before="60" w:after="120" w:line="260" w:lineRule="auto"/>
+        <w:ind w:left="360"/>
+        <w:shd w:val="clear" w:color="auto" w:fill="F3F5F6"/>
+      </w:pPr>
+      <w:r>
+        <w:rPr>
+          <w:rFonts w:ascii="Consolas" w:hAnsi="Consolas" w:cs="Consolas"/>
+          <w:color w:val="1F2933"/>
+          <w:sz w:val="21"/>
+        </w:rPr>
+        <w:t xml:space="preserve">docker compose up --build</w:t>
+      </w:r>
+    </w:p>
     <w:p/>
     <w:p>
       <w:pPr>
@@ -502,35 +416,21 @@
         <w:t>В браузере открыть:</w:t>
       </w:r>
     </w:p>
-    <w:tbl>
-      <w:tblPr>
-        <w:tblW w:type="auto" w:w="0"/>
-        <w:tblLayout w:type="autofit"/>
-        <w:tblLook w:firstColumn="1" w:firstRow="1" w:lastColumn="0" w:lastRow="0" w:noHBand="0" w:noVBand="1" w:val="04A0"/>
-      </w:tblPr>
-      <w:tblGrid>
-        <w:gridCol w:w="10080"/>
-      </w:tblGrid>
-      <w:tr>
-        <w:tc>
-          <w:tcPr>
-            <w:tcW w:type="dxa" w:w="10080"/>
-            <w:shd w:fill="EEF5FB"/>
-          </w:tcPr>
-          <w:p>
-            <w:r>
-              <w:rPr>
-                <w:rFonts w:ascii="Consolas" w:hAnsi="Consolas" w:eastAsia="Consolas"/>
-                <w:b w:val="0"/>
-                <w:color w:val="1F4E79"/>
-                <w:sz w:val="19"/>
-              </w:rPr>
-              <w:t>http://localhost:3000</w:t>
-            </w:r>
-          </w:p>
-        </w:tc>
-      </w:tr>
-    </w:tbl>
+    <w:p>
+      <w:pPr>
+        <w:spacing w:before="60" w:after="120" w:line="260" w:lineRule="auto"/>
+        <w:ind w:left="360"/>
+        <w:shd w:val="clear" w:color="auto" w:fill="F3F5F6"/>
+      </w:pPr>
+      <w:r>
+        <w:rPr>
+          <w:rFonts w:ascii="Consolas" w:hAnsi="Consolas" w:cs="Consolas"/>
+          <w:color w:val="1F2933"/>
+          <w:sz w:val="21"/>
+        </w:rPr>
+        <w:t xml:space="preserve">http://localhost:3000</w:t>
+      </w:r>
+    </w:p>
     <w:p/>
     <w:p>
       <w:pPr>
@@ -559,35 +459,21 @@
         <w:t>В том же окне терминала нажать:</w:t>
       </w:r>
     </w:p>
-    <w:tbl>
-      <w:tblPr>
-        <w:tblW w:type="auto" w:w="0"/>
-        <w:tblLayout w:type="autofit"/>
-        <w:tblLook w:firstColumn="1" w:firstRow="1" w:lastColumn="0" w:lastRow="0" w:noHBand="0" w:noVBand="1" w:val="04A0"/>
-      </w:tblPr>
-      <w:tblGrid>
-        <w:gridCol w:w="10080"/>
-      </w:tblGrid>
-      <w:tr>
-        <w:tc>
-          <w:tcPr>
-            <w:tcW w:type="dxa" w:w="10080"/>
-            <w:shd w:fill="EEF5FB"/>
-          </w:tcPr>
-          <w:p>
-            <w:r>
-              <w:rPr>
-                <w:rFonts w:ascii="Consolas" w:hAnsi="Consolas" w:eastAsia="Consolas"/>
-                <w:b w:val="0"/>
-                <w:color w:val="1F4E79"/>
-                <w:sz w:val="19"/>
-              </w:rPr>
-              <w:t>Ctrl + C</w:t>
-            </w:r>
-          </w:p>
-        </w:tc>
-      </w:tr>
-    </w:tbl>
+    <w:p>
+      <w:pPr>
+        <w:spacing w:before="60" w:after="120" w:line="260" w:lineRule="auto"/>
+        <w:ind w:left="360"/>
+        <w:shd w:val="clear" w:color="auto" w:fill="F3F5F6"/>
+      </w:pPr>
+      <w:r>
+        <w:rPr>
+          <w:rFonts w:ascii="Consolas" w:hAnsi="Consolas" w:cs="Consolas"/>
+          <w:color w:val="1F2933"/>
+          <w:sz w:val="21"/>
+        </w:rPr>
+        <w:t xml:space="preserve">Ctrl + C</w:t>
+      </w:r>
+    </w:p>
     <w:p/>
     <w:p>
       <w:pPr>
@@ -602,35 +488,21 @@
         <w:t>Или выполнить:</w:t>
       </w:r>
     </w:p>
-    <w:tbl>
-      <w:tblPr>
-        <w:tblW w:type="auto" w:w="0"/>
-        <w:tblLayout w:type="autofit"/>
-        <w:tblLook w:firstColumn="1" w:firstRow="1" w:lastColumn="0" w:lastRow="0" w:noHBand="0" w:noVBand="1" w:val="04A0"/>
-      </w:tblPr>
-      <w:tblGrid>
-        <w:gridCol w:w="10080"/>
-      </w:tblGrid>
-      <w:tr>
-        <w:tc>
-          <w:tcPr>
-            <w:tcW w:type="dxa" w:w="10080"/>
-            <w:shd w:fill="EEF5FB"/>
-          </w:tcPr>
-          <w:p>
-            <w:r>
-              <w:rPr>
-                <w:rFonts w:ascii="Consolas" w:hAnsi="Consolas" w:eastAsia="Consolas"/>
-                <w:b w:val="0"/>
-                <w:color w:val="1F4E79"/>
-                <w:sz w:val="19"/>
-              </w:rPr>
-              <w:t>docker compose down</w:t>
-            </w:r>
-          </w:p>
-        </w:tc>
-      </w:tr>
-    </w:tbl>
+    <w:p>
+      <w:pPr>
+        <w:spacing w:before="60" w:after="120" w:line="260" w:lineRule="auto"/>
+        <w:ind w:left="360"/>
+        <w:shd w:val="clear" w:color="auto" w:fill="F3F5F6"/>
+      </w:pPr>
+      <w:r>
+        <w:rPr>
+          <w:rFonts w:ascii="Consolas" w:hAnsi="Consolas" w:cs="Consolas"/>
+          <w:color w:val="1F2933"/>
+          <w:sz w:val="21"/>
+        </w:rPr>
+        <w:t xml:space="preserve">docker compose down</w:t>
+      </w:r>
+    </w:p>
     <w:p/>
     <w:p>
       <w:pPr>

</xml_diff>